<commit_message>
fix: force redeploy to restore styling
</commit_message>
<xml_diff>
--- a/docs/Session_Summary_2026-03-29.docx
+++ b/docs/Session_Summary_2026-03-29.docx
@@ -46,7 +46,7 @@
           <w:sz w:val="19"/>
           <w:szCs w:val="19"/>
         </w:rPr>
-        <w:t xml:space="preserve">March 29, 2026  |  Evening Session  |  ~3.5 hours</w:t>
+        <w:t xml:space="preserve">March 29, 2026  |  Evening Session  |  ~4 hours</w:t>
       </w:r>
     </w:p>
     <w:p>
@@ -58,7 +58,7 @@
         <w:rPr>
           <w:rFonts w:ascii="Arial" w:cs="Arial" w:eastAsia="Arial" w:hAnsi="Arial"/>
         </w:rPr>
-        <w:t xml:space="preserve">Session Grade: 94/100</w:t>
+        <w:t xml:space="preserve">Session Grade: 93/100</w:t>
       </w:r>
     </w:p>
     <w:p>
@@ -68,13 +68,11 @@
       <w:r>
         <w:rPr>
           <w:rFonts w:ascii="Arial" w:cs="Arial" w:eastAsia="Arial" w:hAnsi="Arial"/>
-          <w:b w:val="false"/>
-          <w:bCs w:val="false"/>
           <w:color w:val="333333"/>
           <w:sz w:val="21"/>
           <w:szCs w:val="21"/>
         </w:rPr>
-        <w:t xml:space="preserve">This was the highest-output session to date. Four roadmap items closed (D1, D2, B1, B5) plus five conversion improvements that weren't even on the roadmap. The about page went from zero to deployed with real-time copy iteration. The email capture screen and brief preview are the kind of product decisions that compound over time. The D1 query endpoint unlocks operational intelligence going forward.</w:t>
+        <w:t xml:space="preserve">Highest-output session to date. Five roadmap items closed (D1, D2, B1, B5 POST + GET). Six conversion improvements not on the roadmap. About page from zero to deployed with real-time copy iteration. Email capture screen and brief preview are product decisions that compound. D1 query infrastructure enables real-time data analysis from chat. First live pull confirmed 5 real leads across consulting, medtech, and financial services.</w:t>
       </w:r>
     </w:p>
     <w:p>
@@ -99,7 +97,7 @@
           <w:sz w:val="21"/>
           <w:szCs w:val="21"/>
         </w:rPr>
-        <w:t xml:space="preserve">-3 for admin key exposure in chat (rotate immediately). -2 for skip button blank screen bug shipping to production (caught and fixed quickly, but should have been caught in Claude Code before push). -1 for initial roadmap built without asking Nick for full scope.</w:t>
+        <w:t xml:space="preserve">-3 admin key exposed twice (rotated both times). -2 skip button blank screen shipped before testing. -1 initial roadmap built without confirming scope. -1 session length (~4 hrs vs 30-60 min cadence).</w:t>
       </w:r>
     </w:p>
     <w:p>
@@ -360,7 +358,7 @@
                 <w:sz w:val="19"/>
                 <w:szCs w:val="19"/>
               </w:rPr>
-              <w:t xml:space="preserve">About page: 4 beats + personal section + headshot + contact</w:t>
+              <w:t xml:space="preserve">About page: 4 beats + personal + headshot + contact section</w:t>
             </w:r>
           </w:p>
         </w:tc>
@@ -428,7 +426,7 @@
                 <w:sz w:val="19"/>
                 <w:szCs w:val="19"/>
               </w:rPr>
-              <w:t xml:space="preserve">D1 query endpoint (functions/d1-query.js)</w:t>
+              <w:t xml:space="preserve">D1 POST query endpoint (functions/d1-query.js)</w:t>
             </w:r>
           </w:p>
         </w:tc>
@@ -496,7 +494,7 @@
                 <w:sz w:val="19"/>
                 <w:szCs w:val="19"/>
               </w:rPr>
-              <w:t xml:space="preserve">Email capture screen before results</w:t>
+              <w:t xml:space="preserve">D1 GET query endpoint (functions/d1-read.js) for chat querying</w:t>
             </w:r>
           </w:p>
         </w:tc>
@@ -529,7 +527,7 @@
                 <w:sz w:val="19"/>
                 <w:szCs w:val="19"/>
               </w:rPr>
-              <w:t xml:space="preserve">Conversion improvement</w:t>
+              <w:t xml:space="preserve">B5 extension</w:t>
             </w:r>
           </w:p>
         </w:tc>
@@ -564,7 +562,7 @@
                 <w:sz w:val="19"/>
                 <w:szCs w:val="19"/>
               </w:rPr>
-              <w:t xml:space="preserve">Brief preview with 5 locked section titles</w:t>
+              <w:t xml:space="preserve">Email capture screen before results (peak-intent intercept)</w:t>
             </w:r>
           </w:p>
         </w:tc>
@@ -597,7 +595,7 @@
                 <w:sz w:val="19"/>
                 <w:szCs w:val="19"/>
               </w:rPr>
-              <w:t xml:space="preserve">Conversion improvement</w:t>
+              <w:t xml:space="preserve">Conversion</w:t>
             </w:r>
           </w:p>
         </w:tc>
@@ -632,7 +630,7 @@
                 <w:sz w:val="19"/>
                 <w:szCs w:val="19"/>
               </w:rPr>
-              <w:t xml:space="preserve">Sticky 'Get My Brief' bar on results page</w:t>
+              <w:t xml:space="preserve">Brief preview with 5 locked section titles above form</w:t>
             </w:r>
           </w:p>
         </w:tc>
@@ -665,7 +663,7 @@
                 <w:sz w:val="19"/>
                 <w:szCs w:val="19"/>
               </w:rPr>
-              <w:t xml:space="preserve">Conversion improvement</w:t>
+              <w:t xml:space="preserve">Conversion</w:t>
             </w:r>
           </w:p>
         </w:tc>
@@ -700,7 +698,7 @@
                 <w:sz w:val="19"/>
                 <w:szCs w:val="19"/>
               </w:rPr>
-              <w:t xml:space="preserve">Progress bar visibility fix</w:t>
+              <w:t xml:space="preserve">Sticky 'Get My Brief' bar on results page</w:t>
             </w:r>
           </w:p>
         </w:tc>
@@ -733,7 +731,7 @@
                 <w:sz w:val="19"/>
                 <w:szCs w:val="19"/>
               </w:rPr>
-              <w:t xml:space="preserve">Bug fix</w:t>
+              <w:t xml:space="preserve">Conversion</w:t>
             </w:r>
           </w:p>
         </w:tc>
@@ -768,7 +766,7 @@
                 <w:sz w:val="19"/>
                 <w:szCs w:val="19"/>
               </w:rPr>
-              <w:t xml:space="preserve">Signal log spreadsheet created (Kevin entry)</w:t>
+              <w:t xml:space="preserve">Progress bar sticky visibility fix</w:t>
             </w:r>
           </w:p>
         </w:tc>
@@ -801,7 +799,7 @@
                 <w:sz w:val="19"/>
                 <w:szCs w:val="19"/>
               </w:rPr>
-              <w:t xml:space="preserve">D4 started</w:t>
+              <w:t xml:space="preserve">Bug fix</w:t>
             </w:r>
           </w:p>
         </w:tc>
@@ -836,7 +834,7 @@
                 <w:sz w:val="19"/>
                 <w:szCs w:val="19"/>
               </w:rPr>
-              <w:t xml:space="preserve">Full project roadmap v2 (17 open items)</w:t>
+              <w:t xml:space="preserve">Signal log spreadsheet created (Kevin entry)</w:t>
             </w:r>
           </w:p>
         </w:tc>
@@ -869,12 +867,1003 @@
                 <w:sz w:val="19"/>
                 <w:szCs w:val="19"/>
               </w:rPr>
+              <w:t xml:space="preserve">D4 started</w:t>
+            </w:r>
+          </w:p>
+        </w:tc>
+      </w:tr>
+      <w:tr>
+        <w:tc>
+          <w:tcPr>
+            <w:tcW w:type="dxa" w:w="4680"/>
+            <w:tcBorders>
+              <w:top w:val="single" w:color="CCCCCC" w:sz="1"/>
+              <w:left w:val="single" w:color="CCCCCC" w:sz="1"/>
+              <w:bottom w:val="single" w:color="CCCCCC" w:sz="1"/>
+              <w:right w:val="single" w:color="CCCCCC" w:sz="1"/>
+            </w:tcBorders>
+            <w:tcMar>
+              <w:top w:type="dxa" w:w="80"/>
+              <w:left w:type="dxa" w:w="120"/>
+              <w:bottom w:type="dxa" w:w="80"/>
+              <w:right w:type="dxa" w:w="120"/>
+            </w:tcMar>
+          </w:tcPr>
+          <w:p>
+            <w:pPr>
+              <w:spacing w:after="0"/>
+            </w:pPr>
+            <w:r>
+              <w:rPr>
+                <w:rFonts w:ascii="Arial" w:cs="Arial" w:eastAsia="Arial" w:hAnsi="Arial"/>
+                <w:b w:val="false"/>
+                <w:bCs w:val="false"/>
+                <w:color w:val="333333"/>
+                <w:sz w:val="19"/>
+                <w:szCs w:val="19"/>
+              </w:rPr>
+              <w:t xml:space="preserve">Full project roadmap v2 (17 items, dependency map)</w:t>
+            </w:r>
+          </w:p>
+        </w:tc>
+        <w:tc>
+          <w:tcPr>
+            <w:tcW w:type="dxa" w:w="4680"/>
+            <w:tcBorders>
+              <w:top w:val="single" w:color="CCCCCC" w:sz="1"/>
+              <w:left w:val="single" w:color="CCCCCC" w:sz="1"/>
+              <w:bottom w:val="single" w:color="CCCCCC" w:sz="1"/>
+              <w:right w:val="single" w:color="CCCCCC" w:sz="1"/>
+            </w:tcBorders>
+            <w:tcMar>
+              <w:top w:type="dxa" w:w="80"/>
+              <w:left w:type="dxa" w:w="120"/>
+              <w:bottom w:type="dxa" w:w="80"/>
+              <w:right w:type="dxa" w:w="120"/>
+            </w:tcMar>
+          </w:tcPr>
+          <w:p>
+            <w:pPr>
+              <w:spacing w:after="0"/>
+            </w:pPr>
+            <w:r>
+              <w:rPr>
+                <w:rFonts w:ascii="Arial" w:cs="Arial" w:eastAsia="Arial" w:hAnsi="Arial"/>
+                <w:b w:val="false"/>
+                <w:bCs w:val="false"/>
+                <w:color w:val="333333"/>
+                <w:sz w:val="19"/>
+                <w:szCs w:val="19"/>
+              </w:rPr>
               <w:t xml:space="preserve">Planning</w:t>
+            </w:r>
+          </w:p>
+        </w:tc>
+      </w:tr>
+      <w:tr>
+        <w:tc>
+          <w:tcPr>
+            <w:tcW w:type="dxa" w:w="4680"/>
+            <w:tcBorders>
+              <w:top w:val="single" w:color="CCCCCC" w:sz="1"/>
+              <w:left w:val="single" w:color="CCCCCC" w:sz="1"/>
+              <w:bottom w:val="single" w:color="CCCCCC" w:sz="1"/>
+              <w:right w:val="single" w:color="CCCCCC" w:sz="1"/>
+            </w:tcBorders>
+            <w:tcMar>
+              <w:top w:type="dxa" w:w="80"/>
+              <w:left w:type="dxa" w:w="120"/>
+              <w:bottom w:type="dxa" w:w="80"/>
+              <w:right w:type="dxa" w:w="120"/>
+            </w:tcMar>
+          </w:tcPr>
+          <w:p>
+            <w:pPr>
+              <w:spacing w:after="0"/>
+            </w:pPr>
+            <w:r>
+              <w:rPr>
+                <w:rFonts w:ascii="Arial" w:cs="Arial" w:eastAsia="Arial" w:hAnsi="Arial"/>
+                <w:b w:val="false"/>
+                <w:bCs w:val="false"/>
+                <w:color w:val="333333"/>
+                <w:sz w:val="19"/>
+                <w:szCs w:val="19"/>
+              </w:rPr>
+              <w:t xml:space="preserve">Processed headshot (circular crop, dark bg, web-optimized)</w:t>
+            </w:r>
+          </w:p>
+        </w:tc>
+        <w:tc>
+          <w:tcPr>
+            <w:tcW w:type="dxa" w:w="4680"/>
+            <w:tcBorders>
+              <w:top w:val="single" w:color="CCCCCC" w:sz="1"/>
+              <w:left w:val="single" w:color="CCCCCC" w:sz="1"/>
+              <w:bottom w:val="single" w:color="CCCCCC" w:sz="1"/>
+              <w:right w:val="single" w:color="CCCCCC" w:sz="1"/>
+            </w:tcBorders>
+            <w:tcMar>
+              <w:top w:type="dxa" w:w="80"/>
+              <w:left w:type="dxa" w:w="120"/>
+              <w:bottom w:type="dxa" w:w="80"/>
+              <w:right w:type="dxa" w:w="120"/>
+            </w:tcMar>
+          </w:tcPr>
+          <w:p>
+            <w:pPr>
+              <w:spacing w:after="0"/>
+            </w:pPr>
+            <w:r>
+              <w:rPr>
+                <w:rFonts w:ascii="Arial" w:cs="Arial" w:eastAsia="Arial" w:hAnsi="Arial"/>
+                <w:b w:val="false"/>
+                <w:bCs w:val="false"/>
+                <w:color w:val="333333"/>
+                <w:sz w:val="19"/>
+                <w:szCs w:val="19"/>
+              </w:rPr>
+              <w:t xml:space="preserve">Asset</w:t>
             </w:r>
           </w:p>
         </w:tc>
       </w:tr>
     </w:tbl>
+    <w:p>
+      <w:pPr>
+        <w:pStyle w:val="Heading1"/>
+        <w:spacing w:after="120" w:before="280"/>
+      </w:pPr>
+      <w:r>
+        <w:rPr>
+          <w:rFonts w:ascii="Arial" w:cs="Arial" w:eastAsia="Arial" w:hAnsi="Arial"/>
+        </w:rPr>
+        <w:t xml:space="preserve">Live Data: First Chat Query</w:t>
+      </w:r>
+    </w:p>
+    <w:p>
+      <w:pPr>
+        <w:spacing w:after="130"/>
+      </w:pPr>
+      <w:r>
+        <w:rPr>
+          <w:rFonts w:ascii="Arial" w:cs="Arial" w:eastAsia="Arial" w:hAnsi="Arial"/>
+          <w:color w:val="333333"/>
+          <w:sz w:val="21"/>
+          <w:szCs w:val="21"/>
+        </w:rPr>
+        <w:t xml:space="preserve">D1 GET endpoint tested successfully. First live query returned 6 email captures from 22 total assessments (5 real leads + 1 test):</w:t>
+      </w:r>
+    </w:p>
+    <w:tbl>
+      <w:tblPr>
+        <w:tblW w:type="dxa" w:w="9360"/>
+        <w:tblBorders>
+          <w:top w:val="single" w:color="auto" w:sz="4"/>
+          <w:left w:val="single" w:color="auto" w:sz="4"/>
+          <w:bottom w:val="single" w:color="auto" w:sz="4"/>
+          <w:right w:val="single" w:color="auto" w:sz="4"/>
+          <w:insideH w:val="single" w:color="auto" w:sz="4"/>
+          <w:insideV w:val="single" w:color="auto" w:sz="4"/>
+        </w:tblBorders>
+      </w:tblPr>
+      <w:tblGrid>
+        <w:gridCol w:w="2000"/>
+        <w:gridCol w:w="2800"/>
+        <w:gridCol w:w="2360"/>
+        <w:gridCol w:w="2200"/>
+      </w:tblGrid>
+      <w:tr>
+        <w:tc>
+          <w:tcPr>
+            <w:tcW w:type="dxa" w:w="2000"/>
+            <w:tcBorders>
+              <w:top w:val="single" w:color="CCCCCC" w:sz="1"/>
+              <w:left w:val="single" w:color="CCCCCC" w:sz="1"/>
+              <w:bottom w:val="single" w:color="CCCCCC" w:sz="1"/>
+              <w:right w:val="single" w:color="CCCCCC" w:sz="1"/>
+            </w:tcBorders>
+            <w:shd w:fill="1A1A1A" w:val="clear"/>
+            <w:tcMar>
+              <w:top w:type="dxa" w:w="80"/>
+              <w:left w:type="dxa" w:w="120"/>
+              <w:bottom w:type="dxa" w:w="80"/>
+              <w:right w:type="dxa" w:w="120"/>
+            </w:tcMar>
+          </w:tcPr>
+          <w:p>
+            <w:r>
+              <w:rPr>
+                <w:rFonts w:ascii="Arial" w:cs="Arial" w:eastAsia="Arial" w:hAnsi="Arial"/>
+                <w:b/>
+                <w:bCs/>
+                <w:color w:val="D4A853"/>
+                <w:sz w:val="19"/>
+                <w:szCs w:val="19"/>
+              </w:rPr>
+              <w:t xml:space="preserve">Name</w:t>
+            </w:r>
+          </w:p>
+        </w:tc>
+        <w:tc>
+          <w:tcPr>
+            <w:tcW w:type="dxa" w:w="2800"/>
+            <w:tcBorders>
+              <w:top w:val="single" w:color="CCCCCC" w:sz="1"/>
+              <w:left w:val="single" w:color="CCCCCC" w:sz="1"/>
+              <w:bottom w:val="single" w:color="CCCCCC" w:sz="1"/>
+              <w:right w:val="single" w:color="CCCCCC" w:sz="1"/>
+            </w:tcBorders>
+            <w:shd w:fill="1A1A1A" w:val="clear"/>
+            <w:tcMar>
+              <w:top w:type="dxa" w:w="80"/>
+              <w:left w:type="dxa" w:w="120"/>
+              <w:bottom w:type="dxa" w:w="80"/>
+              <w:right w:type="dxa" w:w="120"/>
+            </w:tcMar>
+          </w:tcPr>
+          <w:p>
+            <w:r>
+              <w:rPr>
+                <w:rFonts w:ascii="Arial" w:cs="Arial" w:eastAsia="Arial" w:hAnsi="Arial"/>
+                <w:b/>
+                <w:bCs/>
+                <w:color w:val="D4A853"/>
+                <w:sz w:val="19"/>
+                <w:szCs w:val="19"/>
+              </w:rPr>
+              <w:t xml:space="preserve">Email</w:t>
+            </w:r>
+          </w:p>
+        </w:tc>
+        <w:tc>
+          <w:tcPr>
+            <w:tcW w:type="dxa" w:w="2360"/>
+            <w:tcBorders>
+              <w:top w:val="single" w:color="CCCCCC" w:sz="1"/>
+              <w:left w:val="single" w:color="CCCCCC" w:sz="1"/>
+              <w:bottom w:val="single" w:color="CCCCCC" w:sz="1"/>
+              <w:right w:val="single" w:color="CCCCCC" w:sz="1"/>
+            </w:tcBorders>
+            <w:shd w:fill="1A1A1A" w:val="clear"/>
+            <w:tcMar>
+              <w:top w:type="dxa" w:w="80"/>
+              <w:left w:type="dxa" w:w="120"/>
+              <w:bottom w:type="dxa" w:w="80"/>
+              <w:right w:type="dxa" w:w="120"/>
+            </w:tcMar>
+          </w:tcPr>
+          <w:p>
+            <w:r>
+              <w:rPr>
+                <w:rFonts w:ascii="Arial" w:cs="Arial" w:eastAsia="Arial" w:hAnsi="Arial"/>
+                <w:b/>
+                <w:bCs/>
+                <w:color w:val="D4A853"/>
+                <w:sz w:val="19"/>
+                <w:szCs w:val="19"/>
+              </w:rPr>
+              <w:t xml:space="preserve">Company</w:t>
+            </w:r>
+          </w:p>
+        </w:tc>
+        <w:tc>
+          <w:tcPr>
+            <w:tcW w:type="dxa" w:w="2200"/>
+            <w:tcBorders>
+              <w:top w:val="single" w:color="CCCCCC" w:sz="1"/>
+              <w:left w:val="single" w:color="CCCCCC" w:sz="1"/>
+              <w:bottom w:val="single" w:color="CCCCCC" w:sz="1"/>
+              <w:right w:val="single" w:color="CCCCCC" w:sz="1"/>
+            </w:tcBorders>
+            <w:shd w:fill="1A1A1A" w:val="clear"/>
+            <w:tcMar>
+              <w:top w:type="dxa" w:w="80"/>
+              <w:left w:type="dxa" w:w="120"/>
+              <w:bottom w:type="dxa" w:w="80"/>
+              <w:right w:type="dxa" w:w="120"/>
+            </w:tcMar>
+          </w:tcPr>
+          <w:p>
+            <w:r>
+              <w:rPr>
+                <w:rFonts w:ascii="Arial" w:cs="Arial" w:eastAsia="Arial" w:hAnsi="Arial"/>
+                <w:b/>
+                <w:bCs/>
+                <w:color w:val="D4A853"/>
+                <w:sz w:val="19"/>
+                <w:szCs w:val="19"/>
+              </w:rPr>
+              <w:t xml:space="preserve">Verdict</w:t>
+            </w:r>
+          </w:p>
+        </w:tc>
+      </w:tr>
+      <w:tr>
+        <w:tc>
+          <w:tcPr>
+            <w:tcW w:type="dxa" w:w="2000"/>
+            <w:tcBorders>
+              <w:top w:val="single" w:color="CCCCCC" w:sz="1"/>
+              <w:left w:val="single" w:color="CCCCCC" w:sz="1"/>
+              <w:bottom w:val="single" w:color="CCCCCC" w:sz="1"/>
+              <w:right w:val="single" w:color="CCCCCC" w:sz="1"/>
+            </w:tcBorders>
+            <w:tcMar>
+              <w:top w:type="dxa" w:w="80"/>
+              <w:left w:type="dxa" w:w="120"/>
+              <w:bottom w:type="dxa" w:w="80"/>
+              <w:right w:type="dxa" w:w="120"/>
+            </w:tcMar>
+          </w:tcPr>
+          <w:p>
+            <w:pPr>
+              <w:spacing w:after="0"/>
+            </w:pPr>
+            <w:r>
+              <w:rPr>
+                <w:rFonts w:ascii="Arial" w:cs="Arial" w:eastAsia="Arial" w:hAnsi="Arial"/>
+                <w:b w:val="false"/>
+                <w:bCs w:val="false"/>
+                <w:color w:val="333333"/>
+                <w:sz w:val="19"/>
+                <w:szCs w:val="19"/>
+              </w:rPr>
+              <w:t xml:space="preserve">Marc Manos</w:t>
+            </w:r>
+          </w:p>
+        </w:tc>
+        <w:tc>
+          <w:tcPr>
+            <w:tcW w:type="dxa" w:w="2800"/>
+            <w:tcBorders>
+              <w:top w:val="single" w:color="CCCCCC" w:sz="1"/>
+              <w:left w:val="single" w:color="CCCCCC" w:sz="1"/>
+              <w:bottom w:val="single" w:color="CCCCCC" w:sz="1"/>
+              <w:right w:val="single" w:color="CCCCCC" w:sz="1"/>
+            </w:tcBorders>
+            <w:tcMar>
+              <w:top w:type="dxa" w:w="80"/>
+              <w:left w:type="dxa" w:w="120"/>
+              <w:bottom w:type="dxa" w:w="80"/>
+              <w:right w:type="dxa" w:w="120"/>
+            </w:tcMar>
+          </w:tcPr>
+          <w:p>
+            <w:pPr>
+              <w:spacing w:after="0"/>
+            </w:pPr>
+            <w:r>
+              <w:rPr>
+                <w:rFonts w:ascii="Arial" w:cs="Arial" w:eastAsia="Arial" w:hAnsi="Arial"/>
+                <w:b w:val="false"/>
+                <w:bCs w:val="false"/>
+                <w:color w:val="333333"/>
+                <w:sz w:val="19"/>
+                <w:szCs w:val="19"/>
+              </w:rPr>
+              <w:t xml:space="preserve">marcmanos@gmail.com</w:t>
+            </w:r>
+          </w:p>
+        </w:tc>
+        <w:tc>
+          <w:tcPr>
+            <w:tcW w:type="dxa" w:w="2360"/>
+            <w:tcBorders>
+              <w:top w:val="single" w:color="CCCCCC" w:sz="1"/>
+              <w:left w:val="single" w:color="CCCCCC" w:sz="1"/>
+              <w:bottom w:val="single" w:color="CCCCCC" w:sz="1"/>
+              <w:right w:val="single" w:color="CCCCCC" w:sz="1"/>
+            </w:tcBorders>
+            <w:tcMar>
+              <w:top w:type="dxa" w:w="80"/>
+              <w:left w:type="dxa" w:w="120"/>
+              <w:bottom w:type="dxa" w:w="80"/>
+              <w:right w:type="dxa" w:w="120"/>
+            </w:tcMar>
+          </w:tcPr>
+          <w:p>
+            <w:pPr>
+              <w:spacing w:after="0"/>
+            </w:pPr>
+            <w:r>
+              <w:rPr>
+                <w:rFonts w:ascii="Arial" w:cs="Arial" w:eastAsia="Arial" w:hAnsi="Arial"/>
+                <w:b w:val="false"/>
+                <w:bCs w:val="false"/>
+                <w:color w:val="333333"/>
+                <w:sz w:val="19"/>
+                <w:szCs w:val="19"/>
+              </w:rPr>
+              <w:t xml:space="preserve">DA</w:t>
+            </w:r>
+          </w:p>
+        </w:tc>
+        <w:tc>
+          <w:tcPr>
+            <w:tcW w:type="dxa" w:w="2200"/>
+            <w:tcBorders>
+              <w:top w:val="single" w:color="CCCCCC" w:sz="1"/>
+              <w:left w:val="single" w:color="CCCCCC" w:sz="1"/>
+              <w:bottom w:val="single" w:color="CCCCCC" w:sz="1"/>
+              <w:right w:val="single" w:color="CCCCCC" w:sz="1"/>
+            </w:tcBorders>
+            <w:tcMar>
+              <w:top w:type="dxa" w:w="80"/>
+              <w:left w:type="dxa" w:w="120"/>
+              <w:bottom w:type="dxa" w:w="80"/>
+              <w:right w:type="dxa" w:w="120"/>
+            </w:tcMar>
+          </w:tcPr>
+          <w:p>
+            <w:pPr>
+              <w:spacing w:after="0"/>
+            </w:pPr>
+            <w:r>
+              <w:rPr>
+                <w:rFonts w:ascii="Arial" w:cs="Arial" w:eastAsia="Arial" w:hAnsi="Arial"/>
+                <w:b w:val="false"/>
+                <w:bCs w:val="false"/>
+                <w:color w:val="333333"/>
+                <w:sz w:val="19"/>
+                <w:szCs w:val="19"/>
+              </w:rPr>
+              <w:t xml:space="preserve">Amber</w:t>
+            </w:r>
+          </w:p>
+        </w:tc>
+      </w:tr>
+      <w:tr>
+        <w:tc>
+          <w:tcPr>
+            <w:tcW w:type="dxa" w:w="2000"/>
+            <w:tcBorders>
+              <w:top w:val="single" w:color="CCCCCC" w:sz="1"/>
+              <w:left w:val="single" w:color="CCCCCC" w:sz="1"/>
+              <w:bottom w:val="single" w:color="CCCCCC" w:sz="1"/>
+              <w:right w:val="single" w:color="CCCCCC" w:sz="1"/>
+            </w:tcBorders>
+            <w:tcMar>
+              <w:top w:type="dxa" w:w="80"/>
+              <w:left w:type="dxa" w:w="120"/>
+              <w:bottom w:type="dxa" w:w="80"/>
+              <w:right w:type="dxa" w:w="120"/>
+            </w:tcMar>
+          </w:tcPr>
+          <w:p>
+            <w:pPr>
+              <w:spacing w:after="0"/>
+            </w:pPr>
+            <w:r>
+              <w:rPr>
+                <w:rFonts w:ascii="Arial" w:cs="Arial" w:eastAsia="Arial" w:hAnsi="Arial"/>
+                <w:b w:val="false"/>
+                <w:bCs w:val="false"/>
+                <w:color w:val="333333"/>
+                <w:sz w:val="19"/>
+                <w:szCs w:val="19"/>
+              </w:rPr>
+              <w:t xml:space="preserve">Kara Lee Jewell DeLacio</w:t>
+            </w:r>
+          </w:p>
+        </w:tc>
+        <w:tc>
+          <w:tcPr>
+            <w:tcW w:type="dxa" w:w="2800"/>
+            <w:tcBorders>
+              <w:top w:val="single" w:color="CCCCCC" w:sz="1"/>
+              <w:left w:val="single" w:color="CCCCCC" w:sz="1"/>
+              <w:bottom w:val="single" w:color="CCCCCC" w:sz="1"/>
+              <w:right w:val="single" w:color="CCCCCC" w:sz="1"/>
+            </w:tcBorders>
+            <w:tcMar>
+              <w:top w:type="dxa" w:w="80"/>
+              <w:left w:type="dxa" w:w="120"/>
+              <w:bottom w:type="dxa" w:w="80"/>
+              <w:right w:type="dxa" w:w="120"/>
+            </w:tcMar>
+          </w:tcPr>
+          <w:p>
+            <w:pPr>
+              <w:spacing w:after="0"/>
+            </w:pPr>
+            <w:r>
+              <w:rPr>
+                <w:rFonts w:ascii="Arial" w:cs="Arial" w:eastAsia="Arial" w:hAnsi="Arial"/>
+                <w:b w:val="false"/>
+                <w:bCs w:val="false"/>
+                <w:color w:val="333333"/>
+                <w:sz w:val="19"/>
+                <w:szCs w:val="19"/>
+              </w:rPr>
+              <w:t xml:space="preserve">karaleedelacio@gmail.com</w:t>
+            </w:r>
+          </w:p>
+        </w:tc>
+        <w:tc>
+          <w:tcPr>
+            <w:tcW w:type="dxa" w:w="2360"/>
+            <w:tcBorders>
+              <w:top w:val="single" w:color="CCCCCC" w:sz="1"/>
+              <w:left w:val="single" w:color="CCCCCC" w:sz="1"/>
+              <w:bottom w:val="single" w:color="CCCCCC" w:sz="1"/>
+              <w:right w:val="single" w:color="CCCCCC" w:sz="1"/>
+            </w:tcBorders>
+            <w:tcMar>
+              <w:top w:type="dxa" w:w="80"/>
+              <w:left w:type="dxa" w:w="120"/>
+              <w:bottom w:type="dxa" w:w="80"/>
+              <w:right w:type="dxa" w:w="120"/>
+            </w:tcMar>
+          </w:tcPr>
+          <w:p>
+            <w:pPr>
+              <w:spacing w:after="0"/>
+            </w:pPr>
+            <w:r>
+              <w:rPr>
+                <w:rFonts w:ascii="Arial" w:cs="Arial" w:eastAsia="Arial" w:hAnsi="Arial"/>
+                <w:b w:val="false"/>
+                <w:bCs w:val="false"/>
+                <w:color w:val="333333"/>
+                <w:sz w:val="19"/>
+                <w:szCs w:val="19"/>
+              </w:rPr>
+              <w:t xml:space="preserve">IBM</w:t>
+            </w:r>
+          </w:p>
+        </w:tc>
+        <w:tc>
+          <w:tcPr>
+            <w:tcW w:type="dxa" w:w="2200"/>
+            <w:tcBorders>
+              <w:top w:val="single" w:color="CCCCCC" w:sz="1"/>
+              <w:left w:val="single" w:color="CCCCCC" w:sz="1"/>
+              <w:bottom w:val="single" w:color="CCCCCC" w:sz="1"/>
+              <w:right w:val="single" w:color="CCCCCC" w:sz="1"/>
+            </w:tcBorders>
+            <w:tcMar>
+              <w:top w:type="dxa" w:w="80"/>
+              <w:left w:type="dxa" w:w="120"/>
+              <w:bottom w:type="dxa" w:w="80"/>
+              <w:right w:type="dxa" w:w="120"/>
+            </w:tcMar>
+          </w:tcPr>
+          <w:p>
+            <w:pPr>
+              <w:spacing w:after="0"/>
+            </w:pPr>
+            <w:r>
+              <w:rPr>
+                <w:rFonts w:ascii="Arial" w:cs="Arial" w:eastAsia="Arial" w:hAnsi="Arial"/>
+                <w:b w:val="false"/>
+                <w:bCs w:val="false"/>
+                <w:color w:val="333333"/>
+                <w:sz w:val="19"/>
+                <w:szCs w:val="19"/>
+              </w:rPr>
+              <w:t xml:space="preserve">Amber</w:t>
+            </w:r>
+          </w:p>
+        </w:tc>
+      </w:tr>
+      <w:tr>
+        <w:tc>
+          <w:tcPr>
+            <w:tcW w:type="dxa" w:w="2000"/>
+            <w:tcBorders>
+              <w:top w:val="single" w:color="CCCCCC" w:sz="1"/>
+              <w:left w:val="single" w:color="CCCCCC" w:sz="1"/>
+              <w:bottom w:val="single" w:color="CCCCCC" w:sz="1"/>
+              <w:right w:val="single" w:color="CCCCCC" w:sz="1"/>
+            </w:tcBorders>
+            <w:tcMar>
+              <w:top w:type="dxa" w:w="80"/>
+              <w:left w:type="dxa" w:w="120"/>
+              <w:bottom w:type="dxa" w:w="80"/>
+              <w:right w:type="dxa" w:w="120"/>
+            </w:tcMar>
+          </w:tcPr>
+          <w:p>
+            <w:pPr>
+              <w:spacing w:after="0"/>
+            </w:pPr>
+            <w:r>
+              <w:rPr>
+                <w:rFonts w:ascii="Arial" w:cs="Arial" w:eastAsia="Arial" w:hAnsi="Arial"/>
+                <w:b w:val="false"/>
+                <w:bCs w:val="false"/>
+                <w:color w:val="333333"/>
+                <w:sz w:val="19"/>
+                <w:szCs w:val="19"/>
+              </w:rPr>
+              <w:t xml:space="preserve">Jason Menni</w:t>
+            </w:r>
+          </w:p>
+        </w:tc>
+        <w:tc>
+          <w:tcPr>
+            <w:tcW w:type="dxa" w:w="2800"/>
+            <w:tcBorders>
+              <w:top w:val="single" w:color="CCCCCC" w:sz="1"/>
+              <w:left w:val="single" w:color="CCCCCC" w:sz="1"/>
+              <w:bottom w:val="single" w:color="CCCCCC" w:sz="1"/>
+              <w:right w:val="single" w:color="CCCCCC" w:sz="1"/>
+            </w:tcBorders>
+            <w:tcMar>
+              <w:top w:type="dxa" w:w="80"/>
+              <w:left w:type="dxa" w:w="120"/>
+              <w:bottom w:type="dxa" w:w="80"/>
+              <w:right w:type="dxa" w:w="120"/>
+            </w:tcMar>
+          </w:tcPr>
+          <w:p>
+            <w:pPr>
+              <w:spacing w:after="0"/>
+            </w:pPr>
+            <w:r>
+              <w:rPr>
+                <w:rFonts w:ascii="Arial" w:cs="Arial" w:eastAsia="Arial" w:hAnsi="Arial"/>
+                <w:b w:val="false"/>
+                <w:bCs w:val="false"/>
+                <w:color w:val="333333"/>
+                <w:sz w:val="19"/>
+                <w:szCs w:val="19"/>
+              </w:rPr>
+              <w:t xml:space="preserve">jmenni29@gmail.com</w:t>
+            </w:r>
+          </w:p>
+        </w:tc>
+        <w:tc>
+          <w:tcPr>
+            <w:tcW w:type="dxa" w:w="2360"/>
+            <w:tcBorders>
+              <w:top w:val="single" w:color="CCCCCC" w:sz="1"/>
+              <w:left w:val="single" w:color="CCCCCC" w:sz="1"/>
+              <w:bottom w:val="single" w:color="CCCCCC" w:sz="1"/>
+              <w:right w:val="single" w:color="CCCCCC" w:sz="1"/>
+            </w:tcBorders>
+            <w:tcMar>
+              <w:top w:type="dxa" w:w="80"/>
+              <w:left w:type="dxa" w:w="120"/>
+              <w:bottom w:type="dxa" w:w="80"/>
+              <w:right w:type="dxa" w:w="120"/>
+            </w:tcMar>
+          </w:tcPr>
+          <w:p>
+            <w:pPr>
+              <w:spacing w:after="0"/>
+            </w:pPr>
+            <w:r>
+              <w:rPr>
+                <w:rFonts w:ascii="Arial" w:cs="Arial" w:eastAsia="Arial" w:hAnsi="Arial"/>
+                <w:b w:val="false"/>
+                <w:bCs w:val="false"/>
+                <w:color w:val="333333"/>
+                <w:sz w:val="19"/>
+                <w:szCs w:val="19"/>
+              </w:rPr>
+              <w:t xml:space="preserve">Intuitive Surgical</w:t>
+            </w:r>
+          </w:p>
+        </w:tc>
+        <w:tc>
+          <w:tcPr>
+            <w:tcW w:type="dxa" w:w="2200"/>
+            <w:tcBorders>
+              <w:top w:val="single" w:color="CCCCCC" w:sz="1"/>
+              <w:left w:val="single" w:color="CCCCCC" w:sz="1"/>
+              <w:bottom w:val="single" w:color="CCCCCC" w:sz="1"/>
+              <w:right w:val="single" w:color="CCCCCC" w:sz="1"/>
+            </w:tcBorders>
+            <w:tcMar>
+              <w:top w:type="dxa" w:w="80"/>
+              <w:left w:type="dxa" w:w="120"/>
+              <w:bottom w:type="dxa" w:w="80"/>
+              <w:right w:type="dxa" w:w="120"/>
+            </w:tcMar>
+          </w:tcPr>
+          <w:p>
+            <w:pPr>
+              <w:spacing w:after="0"/>
+            </w:pPr>
+            <w:r>
+              <w:rPr>
+                <w:rFonts w:ascii="Arial" w:cs="Arial" w:eastAsia="Arial" w:hAnsi="Arial"/>
+                <w:b w:val="false"/>
+                <w:bCs w:val="false"/>
+                <w:color w:val="333333"/>
+                <w:sz w:val="19"/>
+                <w:szCs w:val="19"/>
+              </w:rPr>
+              <w:t xml:space="preserve">Amber</w:t>
+            </w:r>
+          </w:p>
+        </w:tc>
+      </w:tr>
+      <w:tr>
+        <w:tc>
+          <w:tcPr>
+            <w:tcW w:type="dxa" w:w="2000"/>
+            <w:tcBorders>
+              <w:top w:val="single" w:color="CCCCCC" w:sz="1"/>
+              <w:left w:val="single" w:color="CCCCCC" w:sz="1"/>
+              <w:bottom w:val="single" w:color="CCCCCC" w:sz="1"/>
+              <w:right w:val="single" w:color="CCCCCC" w:sz="1"/>
+            </w:tcBorders>
+            <w:tcMar>
+              <w:top w:type="dxa" w:w="80"/>
+              <w:left w:type="dxa" w:w="120"/>
+              <w:bottom w:type="dxa" w:w="80"/>
+              <w:right w:type="dxa" w:w="120"/>
+            </w:tcMar>
+          </w:tcPr>
+          <w:p>
+            <w:pPr>
+              <w:spacing w:after="0"/>
+            </w:pPr>
+            <w:r>
+              <w:rPr>
+                <w:rFonts w:ascii="Arial" w:cs="Arial" w:eastAsia="Arial" w:hAnsi="Arial"/>
+                <w:b w:val="false"/>
+                <w:bCs w:val="false"/>
+                <w:color w:val="333333"/>
+                <w:sz w:val="19"/>
+                <w:szCs w:val="19"/>
+              </w:rPr>
+              <w:t xml:space="preserve">David Zipkin</w:t>
+            </w:r>
+          </w:p>
+        </w:tc>
+        <w:tc>
+          <w:tcPr>
+            <w:tcW w:type="dxa" w:w="2800"/>
+            <w:tcBorders>
+              <w:top w:val="single" w:color="CCCCCC" w:sz="1"/>
+              <w:left w:val="single" w:color="CCCCCC" w:sz="1"/>
+              <w:bottom w:val="single" w:color="CCCCCC" w:sz="1"/>
+              <w:right w:val="single" w:color="CCCCCC" w:sz="1"/>
+            </w:tcBorders>
+            <w:tcMar>
+              <w:top w:type="dxa" w:w="80"/>
+              <w:left w:type="dxa" w:w="120"/>
+              <w:bottom w:type="dxa" w:w="80"/>
+              <w:right w:type="dxa" w:w="120"/>
+            </w:tcMar>
+          </w:tcPr>
+          <w:p>
+            <w:pPr>
+              <w:spacing w:after="0"/>
+            </w:pPr>
+            <w:r>
+              <w:rPr>
+                <w:rFonts w:ascii="Arial" w:cs="Arial" w:eastAsia="Arial" w:hAnsi="Arial"/>
+                <w:b w:val="false"/>
+                <w:bCs w:val="false"/>
+                <w:color w:val="333333"/>
+                <w:sz w:val="19"/>
+                <w:szCs w:val="19"/>
+              </w:rPr>
+              <w:t xml:space="preserve">dzipkin17@gmail.com</w:t>
+            </w:r>
+          </w:p>
+        </w:tc>
+        <w:tc>
+          <w:tcPr>
+            <w:tcW w:type="dxa" w:w="2360"/>
+            <w:tcBorders>
+              <w:top w:val="single" w:color="CCCCCC" w:sz="1"/>
+              <w:left w:val="single" w:color="CCCCCC" w:sz="1"/>
+              <w:bottom w:val="single" w:color="CCCCCC" w:sz="1"/>
+              <w:right w:val="single" w:color="CCCCCC" w:sz="1"/>
+            </w:tcBorders>
+            <w:tcMar>
+              <w:top w:type="dxa" w:w="80"/>
+              <w:left w:type="dxa" w:w="120"/>
+              <w:bottom w:type="dxa" w:w="80"/>
+              <w:right w:type="dxa" w:w="120"/>
+            </w:tcMar>
+          </w:tcPr>
+          <w:p>
+            <w:pPr>
+              <w:spacing w:after="0"/>
+            </w:pPr>
+            <w:r>
+              <w:rPr>
+                <w:rFonts w:ascii="Arial" w:cs="Arial" w:eastAsia="Arial" w:hAnsi="Arial"/>
+                <w:b w:val="false"/>
+                <w:bCs w:val="false"/>
+                <w:color w:val="333333"/>
+                <w:sz w:val="19"/>
+                <w:szCs w:val="19"/>
+              </w:rPr>
+              <w:t xml:space="preserve">CFGI</w:t>
+            </w:r>
+          </w:p>
+        </w:tc>
+        <w:tc>
+          <w:tcPr>
+            <w:tcW w:type="dxa" w:w="2200"/>
+            <w:tcBorders>
+              <w:top w:val="single" w:color="CCCCCC" w:sz="1"/>
+              <w:left w:val="single" w:color="CCCCCC" w:sz="1"/>
+              <w:bottom w:val="single" w:color="CCCCCC" w:sz="1"/>
+              <w:right w:val="single" w:color="CCCCCC" w:sz="1"/>
+            </w:tcBorders>
+            <w:tcMar>
+              <w:top w:type="dxa" w:w="80"/>
+              <w:left w:type="dxa" w:w="120"/>
+              <w:bottom w:type="dxa" w:w="80"/>
+              <w:right w:type="dxa" w:w="120"/>
+            </w:tcMar>
+          </w:tcPr>
+          <w:p>
+            <w:pPr>
+              <w:spacing w:after="0"/>
+            </w:pPr>
+            <w:r>
+              <w:rPr>
+                <w:rFonts w:ascii="Arial" w:cs="Arial" w:eastAsia="Arial" w:hAnsi="Arial"/>
+                <w:b w:val="false"/>
+                <w:bCs w:val="false"/>
+                <w:color w:val="CC4444"/>
+                <w:sz w:val="19"/>
+                <w:szCs w:val="19"/>
+              </w:rPr>
+              <w:t xml:space="preserve">Red</w:t>
+            </w:r>
+          </w:p>
+        </w:tc>
+      </w:tr>
+      <w:tr>
+        <w:tc>
+          <w:tcPr>
+            <w:tcW w:type="dxa" w:w="2000"/>
+            <w:tcBorders>
+              <w:top w:val="single" w:color="CCCCCC" w:sz="1"/>
+              <w:left w:val="single" w:color="CCCCCC" w:sz="1"/>
+              <w:bottom w:val="single" w:color="CCCCCC" w:sz="1"/>
+              <w:right w:val="single" w:color="CCCCCC" w:sz="1"/>
+            </w:tcBorders>
+            <w:tcMar>
+              <w:top w:type="dxa" w:w="80"/>
+              <w:left w:type="dxa" w:w="120"/>
+              <w:bottom w:type="dxa" w:w="80"/>
+              <w:right w:type="dxa" w:w="120"/>
+            </w:tcMar>
+          </w:tcPr>
+          <w:p>
+            <w:pPr>
+              <w:spacing w:after="0"/>
+            </w:pPr>
+            <w:r>
+              <w:rPr>
+                <w:rFonts w:ascii="Arial" w:cs="Arial" w:eastAsia="Arial" w:hAnsi="Arial"/>
+                <w:b w:val="false"/>
+                <w:bCs w:val="false"/>
+                <w:color w:val="333333"/>
+                <w:sz w:val="19"/>
+                <w:szCs w:val="19"/>
+              </w:rPr>
+              <w:t xml:space="preserve">Sam</w:t>
+            </w:r>
+          </w:p>
+        </w:tc>
+        <w:tc>
+          <w:tcPr>
+            <w:tcW w:type="dxa" w:w="2800"/>
+            <w:tcBorders>
+              <w:top w:val="single" w:color="CCCCCC" w:sz="1"/>
+              <w:left w:val="single" w:color="CCCCCC" w:sz="1"/>
+              <w:bottom w:val="single" w:color="CCCCCC" w:sz="1"/>
+              <w:right w:val="single" w:color="CCCCCC" w:sz="1"/>
+            </w:tcBorders>
+            <w:tcMar>
+              <w:top w:type="dxa" w:w="80"/>
+              <w:left w:type="dxa" w:w="120"/>
+              <w:bottom w:type="dxa" w:w="80"/>
+              <w:right w:type="dxa" w:w="120"/>
+            </w:tcMar>
+          </w:tcPr>
+          <w:p>
+            <w:pPr>
+              <w:spacing w:after="0"/>
+            </w:pPr>
+            <w:r>
+              <w:rPr>
+                <w:rFonts w:ascii="Arial" w:cs="Arial" w:eastAsia="Arial" w:hAnsi="Arial"/>
+                <w:b w:val="false"/>
+                <w:bCs w:val="false"/>
+                <w:color w:val="333333"/>
+                <w:sz w:val="19"/>
+                <w:szCs w:val="19"/>
+              </w:rPr>
+              <w:t xml:space="preserve">sam.booras1@gmail.com</w:t>
+            </w:r>
+          </w:p>
+        </w:tc>
+        <w:tc>
+          <w:tcPr>
+            <w:tcW w:type="dxa" w:w="2360"/>
+            <w:tcBorders>
+              <w:top w:val="single" w:color="CCCCCC" w:sz="1"/>
+              <w:left w:val="single" w:color="CCCCCC" w:sz="1"/>
+              <w:bottom w:val="single" w:color="CCCCCC" w:sz="1"/>
+              <w:right w:val="single" w:color="CCCCCC" w:sz="1"/>
+            </w:tcBorders>
+            <w:tcMar>
+              <w:top w:type="dxa" w:w="80"/>
+              <w:left w:type="dxa" w:w="120"/>
+              <w:bottom w:type="dxa" w:w="80"/>
+              <w:right w:type="dxa" w:w="120"/>
+            </w:tcMar>
+          </w:tcPr>
+          <w:p>
+            <w:pPr>
+              <w:spacing w:after="0"/>
+            </w:pPr>
+            <w:r>
+              <w:rPr>
+                <w:rFonts w:ascii="Arial" w:cs="Arial" w:eastAsia="Arial" w:hAnsi="Arial"/>
+                <w:b w:val="false"/>
+                <w:bCs w:val="false"/>
+                <w:color w:val="333333"/>
+                <w:sz w:val="19"/>
+                <w:szCs w:val="19"/>
+              </w:rPr>
+              <w:t xml:space="preserve">PwC</w:t>
+            </w:r>
+          </w:p>
+        </w:tc>
+        <w:tc>
+          <w:tcPr>
+            <w:tcW w:type="dxa" w:w="2200"/>
+            <w:tcBorders>
+              <w:top w:val="single" w:color="CCCCCC" w:sz="1"/>
+              <w:left w:val="single" w:color="CCCCCC" w:sz="1"/>
+              <w:bottom w:val="single" w:color="CCCCCC" w:sz="1"/>
+              <w:right w:val="single" w:color="CCCCCC" w:sz="1"/>
+            </w:tcBorders>
+            <w:tcMar>
+              <w:top w:type="dxa" w:w="80"/>
+              <w:left w:type="dxa" w:w="120"/>
+              <w:bottom w:type="dxa" w:w="80"/>
+              <w:right w:type="dxa" w:w="120"/>
+            </w:tcMar>
+          </w:tcPr>
+          <w:p>
+            <w:pPr>
+              <w:spacing w:after="0"/>
+            </w:pPr>
+            <w:r>
+              <w:rPr>
+                <w:rFonts w:ascii="Arial" w:cs="Arial" w:eastAsia="Arial" w:hAnsi="Arial"/>
+                <w:b w:val="false"/>
+                <w:bCs w:val="false"/>
+                <w:color w:val="333333"/>
+                <w:sz w:val="19"/>
+                <w:szCs w:val="19"/>
+              </w:rPr>
+              <w:t xml:space="preserve">Amber</w:t>
+            </w:r>
+          </w:p>
+        </w:tc>
+      </w:tr>
+    </w:tbl>
+    <w:p>
+      <w:pPr>
+        <w:spacing w:after="130"/>
+      </w:pPr>
+      <w:r>
+        <w:rPr>
+          <w:rFonts w:ascii="Arial" w:cs="Arial" w:eastAsia="Arial" w:hAnsi="Arial"/>
+          <w:color w:val="333333"/>
+          <w:sz w:val="21"/>
+          <w:szCs w:val="21"/>
+        </w:rPr>
+        <w:t xml:space="preserve">Industry mix: consulting, medtech, financial services, insurance. 1 Red verdict (CFGI). Strong early diversity.</w:t>
+      </w:r>
+    </w:p>
     <w:p>
       <w:pPr>
         <w:pStyle w:val="Heading1"/>
@@ -902,7 +1891,7 @@
           <w:sz w:val="20"/>
           <w:szCs w:val="20"/>
         </w:rPr>
-        <w:t xml:space="preserve">Beat order flipped: IBM/Enterprise first (current role), MKHSTRY/Taste second (advisory). Removes any implication MKHSTRY is primary role.</w:t>
+        <w:t xml:space="preserve">Beat order flipped: IBM first (current role), MKHSTRY second (advisory). No implication MKHSTRY is primary.</w:t>
       </w:r>
     </w:p>
     <w:p>
@@ -920,7 +1909,7 @@
           <w:sz w:val="20"/>
           <w:szCs w:val="20"/>
         </w:rPr>
-        <w:t xml:space="preserve">Jeff Charney recruited Nick language: 'Not for a resume line. For the instinct, the grit, and the willingness to say what isn't working in a room where nobody else will.'</w:t>
+        <w:t xml:space="preserve">Jeff recruited Nick: 'Not for a resume line. For the instinct, the grit, and the willingness to say what isn't working in a room where nobody else will.'</w:t>
       </w:r>
     </w:p>
     <w:p>
@@ -938,7 +1927,7 @@
           <w:sz w:val="20"/>
           <w:szCs w:val="20"/>
         </w:rPr>
-        <w:t xml:space="preserve">Taste reframed as inherent: 'The collaboration sharpened something Nick already carried' replaces 'In return, Nick learned taste.'</w:t>
+        <w:t xml:space="preserve">Taste as inherent: 'The collaboration sharpened something Nick already carried.'</w:t>
       </w:r>
     </w:p>
     <w:p>
@@ -956,7 +1945,7 @@
           <w:sz w:val="20"/>
           <w:szCs w:val="20"/>
         </w:rPr>
-        <w:t xml:space="preserve">Fortune 100 (not 500) for Progressive/Charney context.</w:t>
+        <w:t xml:space="preserve">Fortune 100 (not 500) for Progressive/Charney.</w:t>
       </w:r>
     </w:p>
     <w:p>
@@ -974,7 +1963,7 @@
           <w:sz w:val="20"/>
           <w:szCs w:val="20"/>
         </w:rPr>
-        <w:t xml:space="preserve">IBM title shortened: 'at IBM' not 'at IBM Consulting, leading AI and automation delivery within Insurance Solutions.'</w:t>
+        <w:t xml:space="preserve">IBM shortened to 'at IBM.' Brand carries itself.</w:t>
       </w:r>
     </w:p>
     <w:p>
@@ -992,7 +1981,7 @@
           <w:sz w:val="20"/>
           <w:szCs w:val="20"/>
         </w:rPr>
-        <w:t xml:space="preserve">'The room' kept over 'the arena' for H1. Understated &gt; borrowed gravitas.</w:t>
+        <w:t xml:space="preserve">H1 kept 'the room' over 'the arena.' Understated &gt; borrowed gravitas.</w:t>
       </w:r>
     </w:p>
     <w:p>
@@ -1010,7 +1999,7 @@
           <w:sz w:val="20"/>
           <w:szCs w:val="20"/>
         </w:rPr>
-        <w:t xml:space="preserve">MKHSTRY deliverables line toned down: 'The work reached rooms where mediocre doesn't survive and the people in them set the standard for their industries.'</w:t>
+        <w:t xml:space="preserve">MKHSTRY: 'The work reached rooms where mediocre doesn't survive and the people in them set the standard for their industries.'</w:t>
       </w:r>
     </w:p>
     <w:p>
@@ -1028,7 +2017,7 @@
           <w:sz w:val="20"/>
           <w:szCs w:val="20"/>
         </w:rPr>
-        <w:t xml:space="preserve">Headshot: circular crop, 200px, floated right at Beat 1. Not centered hero. Research-backed: photo supports the text, doesn't lead the page.</w:t>
+        <w:t xml:space="preserve">Headshot: 200px circle, floated right at Beat 1. Photo supports text, doesn't lead.</w:t>
       </w:r>
     </w:p>
     <w:p>
@@ -1046,7 +2035,7 @@
           <w:sz w:val="20"/>
           <w:szCs w:val="20"/>
         </w:rPr>
-        <w:t xml:space="preserve">'Unlock It' changed to 'Get My Brief': paywall energy removed, user-perspective language.</w:t>
+        <w:t xml:space="preserve">'Unlock It' to 'Get My Brief': paywall energy removed.</w:t>
       </w:r>
     </w:p>
     <w:p>
@@ -1064,7 +2053,7 @@
           <w:sz w:val="20"/>
           <w:szCs w:val="20"/>
         </w:rPr>
-        <w:t xml:space="preserve">Marathon line: 'Two marathons on his belt and always looking for the next challenge.'</w:t>
+        <w:t xml:space="preserve">'Two marathons on his belt and always looking for the next challenge.'</w:t>
       </w:r>
     </w:p>
     <w:p>
@@ -1082,111 +2071,7 @@
           <w:sz w:val="20"/>
           <w:szCs w:val="20"/>
         </w:rPr>
-        <w:t xml:space="preserve">Personal beat added as standalone section: marathon, scuba (rescue + divemaster, working toward instructor), soccer.</w:t>
-      </w:r>
-    </w:p>
-    <w:p>
-      <w:pPr>
-        <w:pStyle w:val="Heading1"/>
-        <w:spacing w:after="120" w:before="280"/>
-      </w:pPr>
-      <w:r>
-        <w:rPr>
-          <w:rFonts w:ascii="Arial" w:cs="Arial" w:eastAsia="Arial" w:hAnsi="Arial"/>
-        </w:rPr>
-        <w:t xml:space="preserve">Conversion Architecture Changes</w:t>
-      </w:r>
-    </w:p>
-    <w:p>
-      <w:pPr>
-        <w:spacing w:after="130"/>
-      </w:pPr>
-      <w:r>
-        <w:rPr>
-          <w:rFonts w:ascii="Arial" w:cs="Arial" w:eastAsia="Arial" w:hAnsi="Arial"/>
-          <w:b/>
-          <w:bCs/>
-          <w:color w:val="333333"/>
-          <w:sz w:val="21"/>
-          <w:szCs w:val="21"/>
-        </w:rPr>
-        <w:t xml:space="preserve">Before this session: </w:t>
-      </w:r>
-      <w:r>
-        <w:rPr>
-          <w:rFonts w:ascii="Arial" w:cs="Arial" w:eastAsia="Arial" w:hAnsi="Arial"/>
-          <w:color w:val="333333"/>
-          <w:sz w:val="21"/>
-          <w:szCs w:val="21"/>
-        </w:rPr>
-        <w:t xml:space="preserve">36% email capture rate (5/14). Contact info only captured if user scrolled to Save Results or filled brief form. No prompt at point of maximum intent.</w:t>
-      </w:r>
-    </w:p>
-    <w:p>
-      <w:pPr>
-        <w:spacing w:after="130"/>
-      </w:pPr>
-      <w:r>
-        <w:rPr>
-          <w:rFonts w:ascii="Arial" w:cs="Arial" w:eastAsia="Arial" w:hAnsi="Arial"/>
-          <w:b/>
-          <w:bCs/>
-          <w:color w:val="333333"/>
-          <w:sz w:val="21"/>
-          <w:szCs w:val="21"/>
-        </w:rPr>
-        <w:t xml:space="preserve">After this session: </w:t>
-      </w:r>
-      <w:r>
-        <w:rPr>
-          <w:rFonts w:ascii="Arial" w:cs="Arial" w:eastAsia="Arial" w:hAnsi="Arial"/>
-          <w:color w:val="333333"/>
-          <w:sz w:val="21"/>
-          <w:szCs w:val="21"/>
-        </w:rPr>
-        <w:t xml:space="preserve">Email capture screen appears between last question and results (peak curiosity moment). Skip link preserves trust. Brief preview shows 5 locked section titles above the form so users understand what they're trading info for. Sticky bottom bar follows user through results until brief section is visible. Expected lift to 45-55% capture rate.</w:t>
-      </w:r>
-    </w:p>
-    <w:p>
-      <w:pPr>
-        <w:spacing w:after="130"/>
-      </w:pPr>
-      <w:r>
-        <w:rPr>
-          <w:rFonts w:ascii="Arial" w:cs="Arial" w:eastAsia="Arial" w:hAnsi="Arial"/>
-          <w:b/>
-          <w:bCs/>
-          <w:color w:val="333333"/>
-          <w:sz w:val="21"/>
-          <w:szCs w:val="21"/>
-        </w:rPr>
-        <w:t xml:space="preserve">Current numbers: </w:t>
-      </w:r>
-      <w:r>
-        <w:rPr>
-          <w:rFonts w:ascii="Arial" w:cs="Arial" w:eastAsia="Arial" w:hAnsi="Arial"/>
-          <w:color w:val="333333"/>
-          <w:sz w:val="21"/>
-          <w:szCs w:val="21"/>
-        </w:rPr>
-        <w:t xml:space="preserve">22 total assessments, 6 with email (27% overall, but many are pre-capture-screen test runs).</w:t>
-      </w:r>
-    </w:p>
-    <w:p>
-      <w:r>
-        <w:br w:type="page"/>
-      </w:r>
-    </w:p>
-    <w:p>
-      <w:pPr>
-        <w:pStyle w:val="Heading1"/>
-        <w:spacing w:after="120" w:before="280"/>
-      </w:pPr>
-      <w:r>
-        <w:rPr>
-          <w:rFonts w:ascii="Arial" w:cs="Arial" w:eastAsia="Arial" w:hAnsi="Arial"/>
-        </w:rPr>
-        <w:t xml:space="preserve">What Nick Did Well</w:t>
+        <w:t xml:space="preserve">Personal Beat 4: scuba (rescue + divemaster, instructor path), soccer, marathon.</w:t>
       </w:r>
     </w:p>
     <w:p>
@@ -1204,7 +2089,111 @@
           <w:sz w:val="20"/>
           <w:szCs w:val="20"/>
         </w:rPr>
-        <w:t xml:space="preserve">Caught scope gap on roadmap v1 immediately ('Wrong, there's a full about page that needs to be built') and insisted on a complete audit before building. This prevented wasted work.</w:t>
+        <w:t xml:space="preserve">Key phrase closers: 1.1rem, text-secondary, thin border. Quiet, not billboard.</w:t>
+      </w:r>
+    </w:p>
+    <w:p>
+      <w:pPr>
+        <w:pStyle w:val="Heading1"/>
+        <w:spacing w:after="120" w:before="280"/>
+      </w:pPr>
+      <w:r>
+        <w:rPr>
+          <w:rFonts w:ascii="Arial" w:cs="Arial" w:eastAsia="Arial" w:hAnsi="Arial"/>
+        </w:rPr>
+        <w:t xml:space="preserve">Conversion Architecture</w:t>
+      </w:r>
+    </w:p>
+    <w:p>
+      <w:pPr>
+        <w:spacing w:after="130"/>
+      </w:pPr>
+      <w:r>
+        <w:rPr>
+          <w:rFonts w:ascii="Arial" w:cs="Arial" w:eastAsia="Arial" w:hAnsi="Arial"/>
+          <w:b/>
+          <w:bCs/>
+          <w:color w:val="333333"/>
+          <w:sz w:val="21"/>
+          <w:szCs w:val="21"/>
+        </w:rPr>
+        <w:t xml:space="preserve">Before: </w:t>
+      </w:r>
+      <w:r>
+        <w:rPr>
+          <w:rFonts w:ascii="Arial" w:cs="Arial" w:eastAsia="Arial" w:hAnsi="Arial"/>
+          <w:color w:val="333333"/>
+          <w:sz w:val="21"/>
+          <w:szCs w:val="21"/>
+        </w:rPr>
+        <w:t xml:space="preserve">36% capture (5/14). Info only captured if user scrolled to Save Results or brief form.</w:t>
+      </w:r>
+    </w:p>
+    <w:p>
+      <w:pPr>
+        <w:spacing w:after="130"/>
+      </w:pPr>
+      <w:r>
+        <w:rPr>
+          <w:rFonts w:ascii="Arial" w:cs="Arial" w:eastAsia="Arial" w:hAnsi="Arial"/>
+          <w:b/>
+          <w:bCs/>
+          <w:color w:val="333333"/>
+          <w:sz w:val="21"/>
+          <w:szCs w:val="21"/>
+        </w:rPr>
+        <w:t xml:space="preserve">After: </w:t>
+      </w:r>
+      <w:r>
+        <w:rPr>
+          <w:rFonts w:ascii="Arial" w:cs="Arial" w:eastAsia="Arial" w:hAnsi="Arial"/>
+          <w:color w:val="333333"/>
+          <w:sz w:val="21"/>
+          <w:szCs w:val="21"/>
+        </w:rPr>
+        <w:t xml:space="preserve">Email capture at peak curiosity (between last question and results). Skip preserves trust. Brief preview shows locked titles above form. Sticky bar follows through results. Expected 45-55% capture.</w:t>
+      </w:r>
+    </w:p>
+    <w:p>
+      <w:pPr>
+        <w:spacing w:after="130"/>
+      </w:pPr>
+      <w:r>
+        <w:rPr>
+          <w:rFonts w:ascii="Arial" w:cs="Arial" w:eastAsia="Arial" w:hAnsi="Arial"/>
+          <w:b/>
+          <w:bCs/>
+          <w:color w:val="333333"/>
+          <w:sz w:val="21"/>
+          <w:szCs w:val="21"/>
+        </w:rPr>
+        <w:t xml:space="preserve">End of session: </w:t>
+      </w:r>
+      <w:r>
+        <w:rPr>
+          <w:rFonts w:ascii="Arial" w:cs="Arial" w:eastAsia="Arial" w:hAnsi="Arial"/>
+          <w:color w:val="333333"/>
+          <w:sz w:val="21"/>
+          <w:szCs w:val="21"/>
+        </w:rPr>
+        <w:t xml:space="preserve">22 assessments, 6 emails. True new-flow conversion TBD as fresh traffic arrives.</w:t>
+      </w:r>
+    </w:p>
+    <w:p>
+      <w:r>
+        <w:br w:type="page"/>
+      </w:r>
+    </w:p>
+    <w:p>
+      <w:pPr>
+        <w:pStyle w:val="Heading1"/>
+        <w:spacing w:after="120" w:before="280"/>
+      </w:pPr>
+      <w:r>
+        <w:rPr>
+          <w:rFonts w:ascii="Arial" w:cs="Arial" w:eastAsia="Arial" w:hAnsi="Arial"/>
+        </w:rPr>
+        <w:t xml:space="preserve">What Nick Did Well</w:t>
       </w:r>
     </w:p>
     <w:p>
@@ -1222,7 +2211,7 @@
           <w:sz w:val="20"/>
           <w:szCs w:val="20"/>
         </w:rPr>
-        <w:t xml:space="preserve">Made strong copy decisions in real-time: the Jeff Charney recruitment framing, the 'instinct, grit, willingness' language, and the Taste-as-inherent reframe all came from Nick's instinct, not prompts.</w:t>
+        <w:t xml:space="preserve">Caught scope gap on roadmap v1 and insisted on complete audit first.</w:t>
       </w:r>
     </w:p>
     <w:p>
@@ -1240,7 +2229,7 @@
           <w:sz w:val="20"/>
           <w:szCs w:val="20"/>
         </w:rPr>
-        <w:t xml:space="preserve">Pushed back on 'the arena' H1 when it felt performative. That editorial judgment IS the Taste dimension in action.</w:t>
+        <w:t xml:space="preserve">Strong real-time copy: Charney recruitment framing, instinct/grit language, Taste-as-inherent reframe.</w:t>
       </w:r>
     </w:p>
     <w:p>
@@ -1258,7 +2247,7 @@
           <w:sz w:val="20"/>
           <w:szCs w:val="20"/>
         </w:rPr>
-        <w:t xml:space="preserve">Recognized the headshot was 'gaudy and intrusive' at 400px centered and asked for research before accepting a default. Ended up with a better placement.</w:t>
+        <w:t xml:space="preserve">Pushed back on 'the arena' when it felt performative. Taste dimension in action.</w:t>
       </w:r>
     </w:p>
     <w:p>
@@ -1276,7 +2265,7 @@
           <w:sz w:val="20"/>
           <w:szCs w:val="20"/>
         </w:rPr>
-        <w:t xml:space="preserve">Spotted 'Unlock It' as potentially abrasive before any data suggested it. Converted to 'Get My Brief' which is cleaner.</w:t>
+        <w:t xml:space="preserve">Recognized headshot was 'gaudy' at 400px centered. Asked for research. Better placement.</w:t>
       </w:r>
     </w:p>
     <w:p>
@@ -1294,7 +2283,7 @@
           <w:sz w:val="20"/>
           <w:szCs w:val="20"/>
         </w:rPr>
-        <w:t xml:space="preserve">Caught the progress bar visibility bug in production, reported clearly.</w:t>
+        <w:t xml:space="preserve">Spotted 'Unlock It' as abrasive before data suggested it.</w:t>
       </w:r>
     </w:p>
     <w:p>
@@ -1312,19 +2301,7 @@
           <w:sz w:val="20"/>
           <w:szCs w:val="20"/>
         </w:rPr>
-        <w:t xml:space="preserve">Insisted on step-by-step presentation instead of document dumps. This kept the session productive and iterative.</w:t>
-      </w:r>
-    </w:p>
-    <w:p>
-      <w:pPr>
-        <w:pStyle w:val="Heading1"/>
-        <w:spacing w:after="120" w:before="280"/>
-      </w:pPr>
-      <w:r>
-        <w:rPr>
-          <w:rFonts w:ascii="Arial" w:cs="Arial" w:eastAsia="Arial" w:hAnsi="Arial"/>
-        </w:rPr>
-        <w:t xml:space="preserve">What Needs Improvement</w:t>
+        <w:t xml:space="preserve">Caught progress bar bug in production, reported clearly.</w:t>
       </w:r>
     </w:p>
     <w:p>
@@ -1342,7 +2319,7 @@
           <w:sz w:val="20"/>
           <w:szCs w:val="20"/>
         </w:rPr>
-        <w:t xml:space="preserve">Admin key was shared in chat. Rotate it tonight. In future sessions, never paste credentials into any chat window, even this one.</w:t>
+        <w:t xml:space="preserve">Insisted on step-by-step execution. Kept session productive.</w:t>
       </w:r>
     </w:p>
     <w:p>
@@ -1360,7 +2337,7 @@
           <w:sz w:val="20"/>
           <w:szCs w:val="20"/>
         </w:rPr>
-        <w:t xml:space="preserve">Test assessment flows after every push before moving to the next feature. The skip button blank screen shipped to production because the push happened before testing.</w:t>
+        <w:t xml:space="preserve">Pushed for GET endpoint when POST wasn't accessible from chat. Solved the problem permanently.</w:t>
       </w:r>
     </w:p>
     <w:p>
@@ -1378,7 +2355,19 @@
           <w:sz w:val="20"/>
           <w:szCs w:val="20"/>
         </w:rPr>
-        <w:t xml:space="preserve">The about page is built but unlinked. It needs a final visual QA pass on mobile (375px) and desktop before going public. Don't rush B2 (nav update) until you've done that review.</w:t>
+        <w:t xml:space="preserve">Recognized email capture timing insight (peak curiosity) immediately.</w:t>
+      </w:r>
+    </w:p>
+    <w:p>
+      <w:pPr>
+        <w:pStyle w:val="Heading1"/>
+        <w:spacing w:after="120" w:before="280"/>
+      </w:pPr>
+      <w:r>
+        <w:rPr>
+          <w:rFonts w:ascii="Arial" w:cs="Arial" w:eastAsia="Arial" w:hAnsi="Arial"/>
+        </w:rPr>
+        <w:t xml:space="preserve">What Needs Improvement</w:t>
       </w:r>
     </w:p>
     <w:p>
@@ -1396,19 +2385,7 @@
           <w:sz w:val="20"/>
           <w:szCs w:val="20"/>
         </w:rPr>
-        <w:t xml:space="preserve">Session ran long (~3.5 hours). The 30-60 minute session cadence from the roadmap is better for sustained progress. Marathon sessions create momentum but also create fatigue-driven mistakes.</w:t>
-      </w:r>
-    </w:p>
-    <w:p>
-      <w:pPr>
-        <w:pStyle w:val="Heading1"/>
-        <w:spacing w:after="120" w:before="280"/>
-      </w:pPr>
-      <w:r>
-        <w:rPr>
-          <w:rFonts w:ascii="Arial" w:cs="Arial" w:eastAsia="Arial" w:hAnsi="Arial"/>
-        </w:rPr>
-        <w:t xml:space="preserve">Decision Points Reached</w:t>
+        <w:t xml:space="preserve">Admin key exposed twice. Use a reference or code word in future sessions.</w:t>
       </w:r>
     </w:p>
     <w:p>
@@ -1426,7 +2403,7 @@
           <w:sz w:val="20"/>
           <w:szCs w:val="20"/>
         </w:rPr>
-        <w:t xml:space="preserve">About page: not linked publicly yet. Link when ready (B2, 5-minute task).</w:t>
+        <w:t xml:space="preserve">Test flows after every push before next feature. Skip button bug shipped to prod.</w:t>
       </w:r>
     </w:p>
     <w:p>
@@ -1444,7 +2421,7 @@
           <w:sz w:val="20"/>
           <w:szCs w:val="20"/>
         </w:rPr>
-        <w:t xml:space="preserve">MCP server project: removed from scope entirely.</w:t>
+        <w:t xml:space="preserve">About page needs mobile + desktop QA before linking publicly.</w:t>
       </w:r>
     </w:p>
     <w:p>
@@ -1462,7 +2439,7 @@
           <w:sz w:val="20"/>
           <w:szCs w:val="20"/>
         </w:rPr>
-        <w:t xml:space="preserve">Job search/interview narrative: removed from active scope.</w:t>
+        <w:t xml:space="preserve">~4 hour session. Shorter cadence reduces fatigue mistakes.</w:t>
       </w:r>
     </w:p>
     <w:p>
@@ -1480,7 +2457,19 @@
           <w:sz w:val="20"/>
           <w:szCs w:val="20"/>
         </w:rPr>
-        <w:t xml:space="preserve">Executive brief via email (B4): identified as next high-impact build. Server-side generation eliminates session dependency.</w:t>
+        <w:t xml:space="preserve">Debug console.logs still in production. Remove first thing next session.</w:t>
+      </w:r>
+    </w:p>
+    <w:p>
+      <w:pPr>
+        <w:pStyle w:val="Heading1"/>
+        <w:spacing w:after="120" w:before="280"/>
+      </w:pPr>
+      <w:r>
+        <w:rPr>
+          <w:rFonts w:ascii="Arial" w:cs="Arial" w:eastAsia="Arial" w:hAnsi="Arial"/>
+        </w:rPr>
+        <w:t xml:space="preserve">Decision Points</w:t>
       </w:r>
     </w:p>
     <w:p>
@@ -1498,7 +2487,7 @@
           <w:sz w:val="20"/>
           <w:szCs w:val="20"/>
         </w:rPr>
-        <w:t xml:space="preserve">Engagement packages: signal log started with Kevin. Need 5+ entries before patterns emerge.</w:t>
+        <w:t xml:space="preserve">About page: built, unlinked. B2 nav update when ready (5 min).</w:t>
       </w:r>
     </w:p>
     <w:p>
@@ -1516,7 +2505,97 @@
           <w:sz w:val="20"/>
           <w:szCs w:val="20"/>
         </w:rPr>
-        <w:t xml:space="preserve">D1 query endpoint live: enables real-time data analysis in future sessions.</w:t>
+        <w:t xml:space="preserve">MCP server: removed from scope.</w:t>
+      </w:r>
+    </w:p>
+    <w:p>
+      <w:pPr>
+        <w:pStyle w:val="ListParagraph"/>
+        <w:numPr>
+          <w:ilvl w:val="0"/>
+          <w:numId w:val="2"/>
+        </w:numPr>
+        <w:spacing w:after="80"/>
+      </w:pPr>
+      <w:r>
+        <w:rPr>
+          <w:rFonts w:ascii="Arial" w:cs="Arial" w:eastAsia="Arial" w:hAnsi="Arial"/>
+          <w:sz w:val="20"/>
+          <w:szCs w:val="20"/>
+        </w:rPr>
+        <w:t xml:space="preserve">Job search narrative: removed from active scope.</w:t>
+      </w:r>
+    </w:p>
+    <w:p>
+      <w:pPr>
+        <w:pStyle w:val="ListParagraph"/>
+        <w:numPr>
+          <w:ilvl w:val="0"/>
+          <w:numId w:val="2"/>
+        </w:numPr>
+        <w:spacing w:after="80"/>
+      </w:pPr>
+      <w:r>
+        <w:rPr>
+          <w:rFonts w:ascii="Arial" w:cs="Arial" w:eastAsia="Arial" w:hAnsi="Arial"/>
+          <w:sz w:val="20"/>
+          <w:szCs w:val="20"/>
+        </w:rPr>
+        <w:t xml:space="preserve">D1 chat workflow: Nick pastes base URL at session start, Claude appends SQL.</w:t>
+      </w:r>
+    </w:p>
+    <w:p>
+      <w:pPr>
+        <w:pStyle w:val="ListParagraph"/>
+        <w:numPr>
+          <w:ilvl w:val="0"/>
+          <w:numId w:val="2"/>
+        </w:numPr>
+        <w:spacing w:after="80"/>
+      </w:pPr>
+      <w:r>
+        <w:rPr>
+          <w:rFonts w:ascii="Arial" w:cs="Arial" w:eastAsia="Arial" w:hAnsi="Arial"/>
+          <w:sz w:val="20"/>
+          <w:szCs w:val="20"/>
+        </w:rPr>
+        <w:t xml:space="preserve">Session summaries: .docx at end of every session for project upload.</w:t>
+      </w:r>
+    </w:p>
+    <w:p>
+      <w:pPr>
+        <w:pStyle w:val="ListParagraph"/>
+        <w:numPr>
+          <w:ilvl w:val="0"/>
+          <w:numId w:val="2"/>
+        </w:numPr>
+        <w:spacing w:after="80"/>
+      </w:pPr>
+      <w:r>
+        <w:rPr>
+          <w:rFonts w:ascii="Arial" w:cs="Arial" w:eastAsia="Arial" w:hAnsi="Arial"/>
+          <w:sz w:val="20"/>
+          <w:szCs w:val="20"/>
+        </w:rPr>
+        <w:t xml:space="preserve">Brief via email (B4): next high-impact build.</w:t>
+      </w:r>
+    </w:p>
+    <w:p>
+      <w:pPr>
+        <w:pStyle w:val="ListParagraph"/>
+        <w:numPr>
+          <w:ilvl w:val="0"/>
+          <w:numId w:val="2"/>
+        </w:numPr>
+        <w:spacing w:after="80"/>
+      </w:pPr>
+      <w:r>
+        <w:rPr>
+          <w:rFonts w:ascii="Arial" w:cs="Arial" w:eastAsia="Arial" w:hAnsi="Arial"/>
+          <w:sz w:val="20"/>
+          <w:szCs w:val="20"/>
+        </w:rPr>
+        <w:t xml:space="preserve">Signal log: started with Kevin. 5+ entries before patterns emerge.</w:t>
       </w:r>
     </w:p>
     <w:p>
@@ -1528,7 +2607,7 @@
         <w:rPr>
           <w:rFonts w:ascii="Arial" w:cs="Arial" w:eastAsia="Arial" w:hAnsi="Arial"/>
         </w:rPr>
-        <w:t xml:space="preserve">Updated Roadmap Status</w:t>
+        <w:t xml:space="preserve">Updated Roadmap</w:t>
       </w:r>
     </w:p>
     <w:tbl>
@@ -2012,7 +3091,7 @@
                 <w:sz w:val="19"/>
                 <w:szCs w:val="19"/>
               </w:rPr>
-              <w:t xml:space="preserve">D1 query endpoint</w:t>
+              <w:t xml:space="preserve">D1 query endpoints (POST + GET)</w:t>
             </w:r>
           </w:p>
         </w:tc>
@@ -2114,7 +3193,7 @@
                 <w:sz w:val="19"/>
                 <w:szCs w:val="19"/>
               </w:rPr>
-              <w:t xml:space="preserve">Nav update (add About link on all pages)</w:t>
+              <w:t xml:space="preserve">Nav update (add About on all pages)</w:t>
             </w:r>
           </w:p>
         </w:tc>
@@ -2352,7 +3431,7 @@
                 <w:sz w:val="19"/>
                 <w:szCs w:val="19"/>
               </w:rPr>
-              <w:t xml:space="preserve">OPEN</w:t>
+              <w:t xml:space="preserve">OPEN — HIGH</w:t>
             </w:r>
           </w:p>
         </w:tc>
@@ -3076,7 +4155,7 @@
         <w:rPr>
           <w:rFonts w:ascii="Arial" w:cs="Arial" w:eastAsia="Arial" w:hAnsi="Arial"/>
         </w:rPr>
-        <w:t xml:space="preserve">Recommended Next Session</w:t>
+        <w:t xml:space="preserve">Next Session</w:t>
       </w:r>
     </w:p>
     <w:p>
@@ -3092,7 +4171,7 @@
           <w:sz w:val="21"/>
           <w:szCs w:val="21"/>
         </w:rPr>
-        <w:t xml:space="preserve">Priority 1: </w:t>
+        <w:t xml:space="preserve">1. </w:t>
       </w:r>
       <w:r>
         <w:rPr>
@@ -3101,7 +4180,7 @@
           <w:sz w:val="21"/>
           <w:szCs w:val="21"/>
         </w:rPr>
-        <w:t xml:space="preserve">Visual QA pass on about page (mobile + desktop). Fix anything that looks off.</w:t>
+        <w:t xml:space="preserve">Remove debug console.logs from assessment-ui.js.</w:t>
       </w:r>
     </w:p>
     <w:p>
@@ -3117,7 +4196,7 @@
           <w:sz w:val="21"/>
           <w:szCs w:val="21"/>
         </w:rPr>
-        <w:t xml:space="preserve">Priority 2: </w:t>
+        <w:t xml:space="preserve">2. </w:t>
       </w:r>
       <w:r>
         <w:rPr>
@@ -3126,7 +4205,7 @@
           <w:sz w:val="21"/>
           <w:szCs w:val="21"/>
         </w:rPr>
-        <w:t xml:space="preserve">Begin UAT v3 testing (T1). Start with Critical cases (Categories 1, 3, 4).</w:t>
+        <w:t xml:space="preserve">Visual QA on about page (mobile 375px + desktop).</w:t>
       </w:r>
     </w:p>
     <w:p>
@@ -3142,7 +4221,7 @@
           <w:sz w:val="21"/>
           <w:szCs w:val="21"/>
         </w:rPr>
-        <w:t xml:space="preserve">Priority 3: </w:t>
+        <w:t xml:space="preserve">3. </w:t>
       </w:r>
       <w:r>
         <w:rPr>
@@ -3151,7 +4230,7 @@
           <w:sz w:val="21"/>
           <w:szCs w:val="21"/>
         </w:rPr>
-        <w:t xml:space="preserve">If time, build B4 (brief via email) since the conversion funnel now drives toward the brief.</w:t>
+        <w:t xml:space="preserve">Begin UAT v3 (T1). Start with 12 Critical cases.</w:t>
       </w:r>
     </w:p>
     <w:p>
@@ -3167,7 +4246,7 @@
           <w:sz w:val="21"/>
           <w:szCs w:val="21"/>
         </w:rPr>
-        <w:t xml:space="preserve">Reminder: </w:t>
+        <w:t xml:space="preserve">4. </w:t>
       </w:r>
       <w:r>
         <w:rPr>
@@ -3176,7 +4255,7 @@
           <w:sz w:val="21"/>
           <w:szCs w:val="21"/>
         </w:rPr>
-        <w:t xml:space="preserve">Rotate admin key before next session.</w:t>
+        <w:t xml:space="preserve">If time, build B4 (brief via email).</w:t>
       </w:r>
     </w:p>
     <w:sectPr>

</xml_diff>